<commit_message>
fix: remove company header from report template
</commit_message>
<xml_diff>
--- a/templates/监测数据分析报告模板-更新.docx
+++ b/templates/监测数据分析报告模板-更新.docx
@@ -28467,144 +28467,7 @@
 
 <file path=word/header1.xml><?xml version="1.0" encoding="utf-8"?>
 <w:hdr xmlns:wpc="http://schemas.microsoft.com/office/word/2010/wordprocessingCanvas" xmlns:cx="http://schemas.microsoft.com/office/drawing/2014/chartex" xmlns:cx1="http://schemas.microsoft.com/office/drawing/2015/9/8/chartex" xmlns:cx2="http://schemas.microsoft.com/office/drawing/2015/10/21/chartex" xmlns:cx3="http://schemas.microsoft.com/office/drawing/2016/5/9/chartex" xmlns:cx4="http://schemas.microsoft.com/office/drawing/2016/5/10/chartex" xmlns:cx5="http://schemas.microsoft.com/office/drawing/2016/5/11/chartex" xmlns:cx6="http://schemas.microsoft.com/office/drawing/2016/5/12/chartex" xmlns:cx7="http://schemas.microsoft.com/office/drawing/2016/5/13/chartex" xmlns:cx8="http://schemas.microsoft.com/office/drawing/2016/5/14/chartex" xmlns:mc="http://schemas.openxmlformats.org/markup-compatibility/2006" xmlns:aink="http://schemas.microsoft.com/office/drawing/2016/ink" xmlns:am3d="http://schemas.microsoft.com/office/drawing/2017/model3d" xmlns:o="urn:schemas-microsoft-com:office:office" xmlns:oel="http://schemas.microsoft.com/office/2019/extlst" xmlns:r="http://schemas.openxmlformats.org/officeDocument/2006/relationships" xmlns:m="http://schemas.openxmlformats.org/officeDocument/2006/math" xmlns:v="urn:schemas-microsoft-com:vml" xmlns:wp14="http://schemas.microsoft.com/office/word/2010/wordprocessingDrawing" xmlns:wp="http://schemas.openxmlformats.org/drawingml/2006/wordprocessingDrawing" xmlns:w10="urn:schemas-microsoft-com:office:word" xmlns:w="http://schemas.openxmlformats.org/wordprocessingml/2006/main" xmlns:w14="http://schemas.microsoft.com/office/word/2010/wordml" xmlns:w15="http://schemas.microsoft.com/office/word/2012/wordml" xmlns:w16cex="http://schemas.microsoft.com/office/word/2018/wordml/cex" xmlns:w16cid="http://schemas.microsoft.com/office/word/2016/wordml/cid" xmlns:w16="http://schemas.microsoft.com/office/word/2018/wordml" xmlns:w16du="http://schemas.microsoft.com/office/word/2023/wordml/word16du" xmlns:w16sdtdh="http://schemas.microsoft.com/office/word/2020/wordml/sdtdatahash" xmlns:w16se="http://schemas.microsoft.com/office/word/2015/wordml/symex" xmlns:wpg="http://schemas.microsoft.com/office/word/2010/wordprocessingGroup" xmlns:wpi="http://schemas.microsoft.com/office/word/2010/wordprocessingInk" xmlns:wne="http://schemas.microsoft.com/office/word/2006/wordml" xmlns:wps="http://schemas.microsoft.com/office/word/2010/wordprocessingShape" mc:Ignorable="w14 w15 w16se w16cid w16 w16cex w16sdtdh w16du wp14">
-  <w:p>
-    <w:pPr>
-      <w:pStyle w:val="ab"/>
-      <w:spacing w:after="160"/>
-      <w:ind w:firstLineChars="0" w:firstLine="0"/>
-      <w:jc w:val="left"/>
-    </w:pPr>
-    <w:r>
-      <w:rPr>
-        <w:noProof/>
-      </w:rPr>
-      <w:drawing>
-        <wp:inline distT="0" distB="0" distL="0" distR="0" wp14:anchorId="66E7A9FD" wp14:editId="6071461F">
-          <wp:extent cx="443230" cy="344170"/>
-          <wp:effectExtent l="0" t="0" r="0" b="17780"/>
-          <wp:docPr id="799036460" name="图片 3" descr="logo-1"/>
-          <wp:cNvGraphicFramePr>
-            <a:graphicFrameLocks xmlns:a="http://schemas.openxmlformats.org/drawingml/2006/main" noChangeAspect="1"/>
-          </wp:cNvGraphicFramePr>
-          <a:graphic xmlns:a="http://schemas.openxmlformats.org/drawingml/2006/main">
-            <a:graphicData uri="http://schemas.openxmlformats.org/drawingml/2006/picture">
-              <pic:pic xmlns:pic="http://schemas.openxmlformats.org/drawingml/2006/picture">
-                <pic:nvPicPr>
-                  <pic:cNvPr id="2" name="图片 3" descr="logo-1"/>
-                  <pic:cNvPicPr>
-                    <a:picLocks noChangeAspect="1"/>
-                  </pic:cNvPicPr>
-                </pic:nvPicPr>
-                <pic:blipFill>
-                  <a:blip r:embed="rId1"/>
-                  <a:srcRect b="16667"/>
-                  <a:stretch>
-                    <a:fillRect/>
-                  </a:stretch>
-                </pic:blipFill>
-                <pic:spPr>
-                  <a:xfrm>
-                    <a:off x="0" y="0"/>
-                    <a:ext cx="469412" cy="364699"/>
-                  </a:xfrm>
-                  <a:prstGeom prst="rect">
-                    <a:avLst/>
-                  </a:prstGeom>
-                  <a:ln>
-                    <a:noFill/>
-                  </a:ln>
-                </pic:spPr>
-              </pic:pic>
-            </a:graphicData>
-          </a:graphic>
-        </wp:inline>
-      </w:drawing>
-    </w:r>
-    <w:r>
-      <w:rPr>
-        <w:noProof/>
-      </w:rPr>
-      <w:drawing>
-        <wp:inline distT="0" distB="0" distL="0" distR="0" wp14:anchorId="749BECB9" wp14:editId="1CD570C4">
-          <wp:extent cx="866140" cy="222250"/>
-          <wp:effectExtent l="0" t="0" r="10795" b="0"/>
-          <wp:docPr id="1710461153" name="图片 1" descr="logo-1"/>
-          <wp:cNvGraphicFramePr>
-            <a:graphicFrameLocks xmlns:a="http://schemas.openxmlformats.org/drawingml/2006/main" noChangeAspect="1"/>
-          </wp:cNvGraphicFramePr>
-          <a:graphic xmlns:a="http://schemas.openxmlformats.org/drawingml/2006/main">
-            <a:graphicData uri="http://schemas.openxmlformats.org/drawingml/2006/picture">
-              <pic:pic xmlns:pic="http://schemas.openxmlformats.org/drawingml/2006/picture">
-                <pic:nvPicPr>
-                  <pic:cNvPr id="3" name="图片 1" descr="logo-1"/>
-                  <pic:cNvPicPr>
-                    <a:picLocks noChangeAspect="1"/>
-                  </pic:cNvPicPr>
-                </pic:nvPicPr>
-                <pic:blipFill>
-                  <a:blip r:embed="rId1"/>
-                  <a:srcRect l="9750" t="81062" r="14460" b="-1935"/>
-                  <a:stretch>
-                    <a:fillRect/>
-                  </a:stretch>
-                </pic:blipFill>
-                <pic:spPr>
-                  <a:xfrm>
-                    <a:off x="0" y="0"/>
-                    <a:ext cx="871571" cy="223998"/>
-                  </a:xfrm>
-                  <a:prstGeom prst="rect">
-                    <a:avLst/>
-                  </a:prstGeom>
-                  <a:ln>
-                    <a:noFill/>
-                  </a:ln>
-                </pic:spPr>
-              </pic:pic>
-            </a:graphicData>
-          </a:graphic>
-        </wp:inline>
-      </w:drawing>
-    </w:r>
-    <w:r>
-      <w:t xml:space="preserve">                                         </w:t>
-    </w:r>
-    <w:r>
-      <w:rPr>
-        <w:rFonts w:hint="eastAsia"/>
-      </w:rPr>
-      <w:t xml:space="preserve">                                        </w:t>
-    </w:r>
-    <w:r>
-      <w:rPr>
-        <w:rFonts w:ascii="等线" w:eastAsia="等线" w:hAnsi="等线" w:cs="Times New Roman" w:hint="eastAsia"/>
-        <w:color w:val="808080"/>
-        <w:szCs w:val="20"/>
-        <w:lang w:bidi="ar"/>
-      </w:rPr>
-      <w:t>北京清环智慧水</w:t>
-    </w:r>
-    <w:proofErr w:type="gramStart"/>
-    <w:r>
-      <w:rPr>
-        <w:rFonts w:ascii="等线" w:eastAsia="等线" w:hAnsi="等线" w:cs="Times New Roman" w:hint="eastAsia"/>
-        <w:color w:val="808080"/>
-        <w:szCs w:val="20"/>
-        <w:lang w:bidi="ar"/>
-      </w:rPr>
-      <w:t>务</w:t>
-    </w:r>
-    <w:proofErr w:type="gramEnd"/>
-    <w:r>
-      <w:rPr>
-        <w:rFonts w:ascii="等线" w:eastAsia="等线" w:hAnsi="等线" w:cs="Times New Roman" w:hint="eastAsia"/>
-        <w:color w:val="808080"/>
-        <w:szCs w:val="20"/>
-        <w:lang w:bidi="ar"/>
-      </w:rPr>
-      <w:t>科技有限公司</w:t>
-    </w:r>
-  </w:p>
+  <w:p/>
 </w:hdr>
 </file>
 

</xml_diff>